<commit_message>
Gestion de nueva acción de personal
</commit_message>
<xml_diff>
--- a/src/assets/iess/inicio-cancelacion/inicio-cancelacion-agrupados-juridica.docx
+++ b/src/assets/iess/inicio-cancelacion/inicio-cancelacion-agrupados-juridica.docx
@@ -26,7 +26,27 @@
           <w:bCs/>
           <w:color w:val="0070C0"/>
         </w:rPr>
-        <w:t>{fechaProvidencia}</w:t>
+        <w:t>{</w:t>
+      </w:r>
+      <w:proofErr w:type="spellStart"/>
+      <w:r>
+        <w:rPr>
+          <w:rFonts w:ascii="Times New Roman" w:hAnsi="Times New Roman"/>
+          <w:b/>
+          <w:bCs/>
+          <w:color w:val="0070C0"/>
+        </w:rPr>
+        <w:t>fechaProvidencia</w:t>
+      </w:r>
+      <w:proofErr w:type="spellEnd"/>
+      <w:r>
+        <w:rPr>
+          <w:rFonts w:ascii="Times New Roman" w:hAnsi="Times New Roman"/>
+          <w:b/>
+          <w:bCs/>
+          <w:color w:val="0070C0"/>
+        </w:rPr>
+        <w:t>}</w:t>
       </w:r>
       <w:r>
         <w:rPr>
@@ -41,7 +61,27 @@
           <w:bCs/>
           <w:color w:val="0070C0"/>
         </w:rPr>
-        <w:t>{horaProvidencia}</w:t>
+        <w:t>{</w:t>
+      </w:r>
+      <w:proofErr w:type="spellStart"/>
+      <w:r>
+        <w:rPr>
+          <w:rFonts w:ascii="Times New Roman" w:hAnsi="Times New Roman"/>
+          <w:b/>
+          <w:bCs/>
+          <w:color w:val="0070C0"/>
+        </w:rPr>
+        <w:t>horaProvidencia</w:t>
+      </w:r>
+      <w:proofErr w:type="spellEnd"/>
+      <w:r>
+        <w:rPr>
+          <w:rFonts w:ascii="Times New Roman" w:hAnsi="Times New Roman"/>
+          <w:b/>
+          <w:bCs/>
+          <w:color w:val="0070C0"/>
+        </w:rPr>
+        <w:t>}</w:t>
       </w:r>
       <w:r>
         <w:rPr>
@@ -56,6 +96,7 @@
         </w:rPr>
         <w:t xml:space="preserve">VISTOS: </w:t>
       </w:r>
+      <w:bookmarkStart w:id="0" w:name="_Hlk218588164"/>
       <w:r>
         <w:rPr>
           <w:rFonts w:ascii="Times New Roman" w:hAnsi="Times New Roman"/>
@@ -78,14 +119,43 @@
           <w:b/>
           <w:bCs/>
         </w:rPr>
-        <w:t>Benitez Estrella Christian Sebastian</w:t>
-      </w:r>
-      <w:r>
-        <w:rPr>
-          <w:rFonts w:ascii="Times New Roman" w:hAnsi="Times New Roman"/>
-        </w:rPr>
-        <w:t xml:space="preserve">, en mi calidad de Directora Provincial de Pichincha Encargada y Ejecutor de Coactiva de la Dirección Provincial de Pichincha del Instituto Ecuatoriano de Seguridad Social, designado mediante Acción de Personal Nro. </w:t>
-      </w:r>
+        <w:t>Benítez</w:t>
+      </w:r>
+      <w:r>
+        <w:rPr>
+          <w:rFonts w:ascii="Times New Roman" w:hAnsi="Times New Roman"/>
+          <w:b/>
+          <w:bCs/>
+        </w:rPr>
+        <w:t xml:space="preserve"> Estrella Christian </w:t>
+      </w:r>
+      <w:r>
+        <w:rPr>
+          <w:rFonts w:ascii="Times New Roman" w:hAnsi="Times New Roman"/>
+          <w:b/>
+          <w:bCs/>
+        </w:rPr>
+        <w:t>Sebastián</w:t>
+      </w:r>
+      <w:r>
+        <w:rPr>
+          <w:rFonts w:ascii="Times New Roman" w:hAnsi="Times New Roman"/>
+        </w:rPr>
+        <w:t>, en mi calidad de Director Provincial de Pichincha Encargad</w:t>
+      </w:r>
+      <w:r>
+        <w:rPr>
+          <w:rFonts w:ascii="Times New Roman" w:hAnsi="Times New Roman"/>
+        </w:rPr>
+        <w:t>o</w:t>
+      </w:r>
+      <w:r>
+        <w:rPr>
+          <w:rFonts w:ascii="Times New Roman" w:hAnsi="Times New Roman"/>
+        </w:rPr>
+        <w:t xml:space="preserve"> y Ejecutor de Coactiva de la Dirección Provincial de Pichincha del Instituto Ecuatoriano de Seguridad Social, designado mediante Acción de Personal Nro. </w:t>
+      </w:r>
+      <w:bookmarkStart w:id="1" w:name="_Hlk218597991"/>
       <w:r>
         <w:rPr>
           <w:rFonts w:ascii="Times New Roman" w:hAnsi="Times New Roman"/>
@@ -122,6 +192,8 @@
         </w:rPr>
         <w:t>11 de diciembre de 2025</w:t>
       </w:r>
+      <w:bookmarkEnd w:id="0"/>
+      <w:bookmarkEnd w:id="1"/>
       <w:r>
         <w:rPr>
           <w:rFonts w:ascii="Times New Roman" w:hAnsi="Times New Roman"/>
@@ -154,7 +226,25 @@
           <w:b/>
           <w:color w:val="0070C0"/>
         </w:rPr>
-        <w:t>{razonSocial}</w:t>
+        <w:t>{</w:t>
+      </w:r>
+      <w:proofErr w:type="spellStart"/>
+      <w:r>
+        <w:rPr>
+          <w:rFonts w:ascii="Times New Roman" w:hAnsi="Times New Roman"/>
+          <w:b/>
+          <w:color w:val="0070C0"/>
+        </w:rPr>
+        <w:t>razonSocial</w:t>
+      </w:r>
+      <w:proofErr w:type="spellEnd"/>
+      <w:r>
+        <w:rPr>
+          <w:rFonts w:ascii="Times New Roman" w:hAnsi="Times New Roman"/>
+          <w:b/>
+          <w:color w:val="0070C0"/>
+        </w:rPr>
+        <w:t>}</w:t>
       </w:r>
       <w:r>
         <w:rPr>
@@ -184,7 +274,27 @@
           <w:bCs/>
           <w:color w:val="0070C0"/>
         </w:rPr>
-        <w:t>{representanteLegal}</w:t>
+        <w:t>{</w:t>
+      </w:r>
+      <w:proofErr w:type="spellStart"/>
+      <w:r>
+        <w:rPr>
+          <w:rFonts w:ascii="Times New Roman" w:hAnsi="Times New Roman"/>
+          <w:b/>
+          <w:bCs/>
+          <w:color w:val="0070C0"/>
+        </w:rPr>
+        <w:t>representanteLegal</w:t>
+      </w:r>
+      <w:proofErr w:type="spellEnd"/>
+      <w:r>
+        <w:rPr>
+          <w:rFonts w:ascii="Times New Roman" w:hAnsi="Times New Roman"/>
+          <w:b/>
+          <w:bCs/>
+          <w:color w:val="0070C0"/>
+        </w:rPr>
+        <w:t>}</w:t>
       </w:r>
       <w:r>
         <w:rPr>
@@ -217,8 +327,8 @@
       </w:tblPr>
       <w:tblGrid>
         <w:gridCol w:w="1271"/>
-        <w:gridCol w:w="3587"/>
-        <w:gridCol w:w="2431"/>
+        <w:gridCol w:w="1701"/>
+        <w:gridCol w:w="4317"/>
         <w:gridCol w:w="2429"/>
       </w:tblGrid>
       <w:tr>
@@ -246,32 +356,43 @@
         </w:tc>
         <w:tc>
           <w:tcPr>
-            <w:tcW w:w="3587" w:type="dxa"/>
+            <w:tcW w:w="1701" w:type="dxa"/>
             <w:shd w:val="clear" w:color="auto" w:fill="4472C4"/>
           </w:tcPr>
           <w:p>
             <w:pPr>
               <w:jc w:val="center"/>
             </w:pPr>
+            <w:proofErr w:type="spellStart"/>
             <w:r>
               <w:rPr>
                 <w:rFonts w:ascii="Times New Roman" w:hAnsi="Times New Roman"/>
                 <w:b/>
                 <w:color w:val="FFFFFF"/>
               </w:rPr>
-              <w:t>Número TC</w:t>
+              <w:t>Número</w:t>
+            </w:r>
+            <w:proofErr w:type="spellEnd"/>
+            <w:r>
+              <w:rPr>
+                <w:rFonts w:ascii="Times New Roman" w:hAnsi="Times New Roman"/>
+                <w:b/>
+                <w:color w:val="FFFFFF"/>
+              </w:rPr>
+              <w:t xml:space="preserve"> TC</w:t>
             </w:r>
           </w:p>
         </w:tc>
         <w:tc>
           <w:tcPr>
-            <w:tcW w:w="2431" w:type="dxa"/>
+            <w:tcW w:w="4317" w:type="dxa"/>
             <w:shd w:val="clear" w:color="auto" w:fill="4472C4"/>
           </w:tcPr>
           <w:p>
             <w:pPr>
               <w:jc w:val="center"/>
             </w:pPr>
+            <w:proofErr w:type="spellStart"/>
             <w:r>
               <w:rPr>
                 <w:rFonts w:ascii="Times New Roman" w:hAnsi="Times New Roman"/>
@@ -280,6 +401,7 @@
               </w:rPr>
               <w:t>Concepto</w:t>
             </w:r>
+            <w:proofErr w:type="spellEnd"/>
           </w:p>
         </w:tc>
         <w:tc>
@@ -297,8 +419,18 @@
                 <w:b/>
                 <w:color w:val="FFFFFF"/>
               </w:rPr>
-              <w:t>Valor capital adeudado</w:t>
-            </w:r>
+              <w:t xml:space="preserve">Valor capital </w:t>
+            </w:r>
+            <w:proofErr w:type="spellStart"/>
+            <w:r>
+              <w:rPr>
+                <w:rFonts w:ascii="Times New Roman" w:hAnsi="Times New Roman"/>
+                <w:b/>
+                <w:color w:val="FFFFFF"/>
+              </w:rPr>
+              <w:t>adeudado</w:t>
+            </w:r>
+            <w:proofErr w:type="spellEnd"/>
           </w:p>
         </w:tc>
       </w:tr>
@@ -315,33 +447,75 @@
               <w:rPr>
                 <w:rFonts w:ascii="Times New Roman" w:hAnsi="Times New Roman"/>
               </w:rPr>
-              <w:t>{#titulos}{orden}</w:t>
+              <w:t>{#</w:t>
+            </w:r>
+            <w:proofErr w:type="gramStart"/>
+            <w:r>
+              <w:rPr>
+                <w:rFonts w:ascii="Times New Roman" w:hAnsi="Times New Roman"/>
+              </w:rPr>
+              <w:t>titulos}{</w:t>
+            </w:r>
+            <w:proofErr w:type="gramEnd"/>
+            <w:r>
+              <w:rPr>
+                <w:rFonts w:ascii="Times New Roman" w:hAnsi="Times New Roman"/>
+              </w:rPr>
+              <w:t>orden}</w:t>
             </w:r>
           </w:p>
         </w:tc>
         <w:tc>
           <w:tcPr>
-            <w:tcW w:w="3587" w:type="dxa"/>
+            <w:tcW w:w="1701" w:type="dxa"/>
           </w:tcPr>
           <w:p>
             <w:r>
               <w:rPr>
                 <w:rFonts w:ascii="Times New Roman" w:hAnsi="Times New Roman"/>
               </w:rPr>
-              <w:t>{numeroTC}</w:t>
+              <w:t>{</w:t>
+            </w:r>
+            <w:proofErr w:type="spellStart"/>
+            <w:r>
+              <w:rPr>
+                <w:rFonts w:ascii="Times New Roman" w:hAnsi="Times New Roman"/>
+              </w:rPr>
+              <w:t>numeroTC</w:t>
+            </w:r>
+            <w:proofErr w:type="spellEnd"/>
+            <w:r>
+              <w:rPr>
+                <w:rFonts w:ascii="Times New Roman" w:hAnsi="Times New Roman"/>
+              </w:rPr>
+              <w:t>}</w:t>
             </w:r>
           </w:p>
         </w:tc>
         <w:tc>
           <w:tcPr>
-            <w:tcW w:w="2431" w:type="dxa"/>
+            <w:tcW w:w="4317" w:type="dxa"/>
           </w:tcPr>
           <w:p>
             <w:r>
               <w:rPr>
                 <w:rFonts w:ascii="Times New Roman" w:hAnsi="Times New Roman"/>
               </w:rPr>
-              <w:t>{concepto}</w:t>
+              <w:t>{</w:t>
+            </w:r>
+            <w:proofErr w:type="spellStart"/>
+            <w:r>
+              <w:rPr>
+                <w:rFonts w:ascii="Times New Roman" w:hAnsi="Times New Roman"/>
+              </w:rPr>
+              <w:t>concepto</w:t>
+            </w:r>
+            <w:proofErr w:type="spellEnd"/>
+            <w:r>
+              <w:rPr>
+                <w:rFonts w:ascii="Times New Roman" w:hAnsi="Times New Roman"/>
+              </w:rPr>
+              <w:t>}</w:t>
             </w:r>
           </w:p>
         </w:tc>
@@ -354,7 +528,35 @@
               <w:rPr>
                 <w:rFonts w:ascii="Times New Roman" w:hAnsi="Times New Roman"/>
               </w:rPr>
-              <w:t>{valorCapital}{/titulos}</w:t>
+              <w:t>{</w:t>
+            </w:r>
+            <w:proofErr w:type="spellStart"/>
+            <w:r>
+              <w:rPr>
+                <w:rFonts w:ascii="Times New Roman" w:hAnsi="Times New Roman"/>
+              </w:rPr>
+              <w:t>valorCapital</w:t>
+            </w:r>
+            <w:proofErr w:type="spellEnd"/>
+            <w:r>
+              <w:rPr>
+                <w:rFonts w:ascii="Times New Roman" w:hAnsi="Times New Roman"/>
+              </w:rPr>
+              <w:t>}{/</w:t>
+            </w:r>
+            <w:proofErr w:type="spellStart"/>
+            <w:r>
+              <w:rPr>
+                <w:rFonts w:ascii="Times New Roman" w:hAnsi="Times New Roman"/>
+              </w:rPr>
+              <w:t>titulos</w:t>
+            </w:r>
+            <w:proofErr w:type="spellEnd"/>
+            <w:r>
+              <w:rPr>
+                <w:rFonts w:ascii="Times New Roman" w:hAnsi="Times New Roman"/>
+              </w:rPr>
+              <w:t>}</w:t>
             </w:r>
           </w:p>
         </w:tc>
@@ -388,7 +590,23 @@
                 <w:rFonts w:ascii="Times New Roman" w:hAnsi="Times New Roman"/>
                 <w:b/>
               </w:rPr>
-              <w:t>{totalCapital}</w:t>
+              <w:t>{</w:t>
+            </w:r>
+            <w:proofErr w:type="spellStart"/>
+            <w:r>
+              <w:rPr>
+                <w:rFonts w:ascii="Times New Roman" w:hAnsi="Times New Roman"/>
+                <w:b/>
+              </w:rPr>
+              <w:t>totalCapital</w:t>
+            </w:r>
+            <w:proofErr w:type="spellEnd"/>
+            <w:r>
+              <w:rPr>
+                <w:rFonts w:ascii="Times New Roman" w:hAnsi="Times New Roman"/>
+                <w:b/>
+              </w:rPr>
+              <w:t>}</w:t>
             </w:r>
           </w:p>
         </w:tc>
@@ -513,7 +731,27 @@
           <w:bCs/>
           <w:color w:val="0070C0"/>
         </w:rPr>
-        <w:t>{razonSocial}</w:t>
+        <w:t>{</w:t>
+      </w:r>
+      <w:proofErr w:type="spellStart"/>
+      <w:r>
+        <w:rPr>
+          <w:rFonts w:ascii="Times New Roman" w:hAnsi="Times New Roman"/>
+          <w:b/>
+          <w:bCs/>
+          <w:color w:val="0070C0"/>
+        </w:rPr>
+        <w:t>razonSocial</w:t>
+      </w:r>
+      <w:proofErr w:type="spellEnd"/>
+      <w:r>
+        <w:rPr>
+          <w:rFonts w:ascii="Times New Roman" w:hAnsi="Times New Roman"/>
+          <w:b/>
+          <w:bCs/>
+          <w:color w:val="0070C0"/>
+        </w:rPr>
+        <w:t>}</w:t>
       </w:r>
       <w:r>
         <w:rPr>
@@ -543,7 +781,27 @@
           <w:bCs/>
           <w:color w:val="0070C0"/>
         </w:rPr>
-        <w:t>{representanteLegal}</w:t>
+        <w:t>{</w:t>
+      </w:r>
+      <w:proofErr w:type="spellStart"/>
+      <w:r>
+        <w:rPr>
+          <w:rFonts w:ascii="Times New Roman" w:hAnsi="Times New Roman"/>
+          <w:b/>
+          <w:bCs/>
+          <w:color w:val="0070C0"/>
+        </w:rPr>
+        <w:t>representanteLegal</w:t>
+      </w:r>
+      <w:proofErr w:type="spellEnd"/>
+      <w:r>
+        <w:rPr>
+          <w:rFonts w:ascii="Times New Roman" w:hAnsi="Times New Roman"/>
+          <w:b/>
+          <w:bCs/>
+          <w:color w:val="0070C0"/>
+        </w:rPr>
+        <w:t>}</w:t>
       </w:r>
       <w:r>
         <w:rPr>
@@ -573,7 +831,27 @@
           <w:bCs/>
           <w:color w:val="0070C0"/>
         </w:rPr>
-        <w:t>{totalCapitalLetras}</w:t>
+        <w:t>{</w:t>
+      </w:r>
+      <w:proofErr w:type="spellStart"/>
+      <w:r>
+        <w:rPr>
+          <w:rFonts w:ascii="Times New Roman" w:hAnsi="Times New Roman"/>
+          <w:b/>
+          <w:bCs/>
+          <w:color w:val="0070C0"/>
+        </w:rPr>
+        <w:t>totalCapitalLetras</w:t>
+      </w:r>
+      <w:proofErr w:type="spellEnd"/>
+      <w:r>
+        <w:rPr>
+          <w:rFonts w:ascii="Times New Roman" w:hAnsi="Times New Roman"/>
+          <w:b/>
+          <w:bCs/>
+          <w:color w:val="0070C0"/>
+        </w:rPr>
+        <w:t>}</w:t>
       </w:r>
       <w:r>
         <w:rPr>
@@ -596,7 +874,27 @@
           <w:bCs/>
           <w:color w:val="0070C0"/>
         </w:rPr>
-        <w:t>{totalCapital}</w:t>
+        <w:t>{</w:t>
+      </w:r>
+      <w:proofErr w:type="spellStart"/>
+      <w:r>
+        <w:rPr>
+          <w:rFonts w:ascii="Times New Roman" w:hAnsi="Times New Roman"/>
+          <w:b/>
+          <w:bCs/>
+          <w:color w:val="0070C0"/>
+        </w:rPr>
+        <w:t>totalCapital</w:t>
+      </w:r>
+      <w:proofErr w:type="spellEnd"/>
+      <w:r>
+        <w:rPr>
+          <w:rFonts w:ascii="Times New Roman" w:hAnsi="Times New Roman"/>
+          <w:b/>
+          <w:bCs/>
+          <w:color w:val="0070C0"/>
+        </w:rPr>
+        <w:t>}</w:t>
       </w:r>
       <w:r>
         <w:rPr>
@@ -640,9 +938,9 @@
         <w:tblLook w:val="04A0" w:firstRow="1" w:lastRow="0" w:firstColumn="1" w:lastColumn="0" w:noHBand="0" w:noVBand="1"/>
       </w:tblPr>
       <w:tblGrid>
-        <w:gridCol w:w="1266"/>
-        <w:gridCol w:w="1865"/>
-        <w:gridCol w:w="2370"/>
+        <w:gridCol w:w="988"/>
+        <w:gridCol w:w="1275"/>
+        <w:gridCol w:w="3238"/>
         <w:gridCol w:w="1270"/>
         <w:gridCol w:w="1129"/>
         <w:gridCol w:w="1796"/>
@@ -653,7 +951,7 @@
         </w:trPr>
         <w:tc>
           <w:tcPr>
-            <w:tcW w:w="1266" w:type="dxa"/>
+            <w:tcW w:w="988" w:type="dxa"/>
             <w:shd w:val="clear" w:color="auto" w:fill="4472C4"/>
           </w:tcPr>
           <w:p>
@@ -661,6 +959,7 @@
               <w:ind w:right="338"/>
               <w:jc w:val="center"/>
             </w:pPr>
+            <w:bookmarkStart w:id="2" w:name="_Hlk218587801"/>
             <w:r>
               <w:rPr>
                 <w:rFonts w:ascii="Times New Roman" w:hAnsi="Times New Roman"/>
@@ -673,32 +972,43 @@
         </w:tc>
         <w:tc>
           <w:tcPr>
-            <w:tcW w:w="1865" w:type="dxa"/>
+            <w:tcW w:w="1275" w:type="dxa"/>
             <w:shd w:val="clear" w:color="auto" w:fill="4472C4"/>
           </w:tcPr>
           <w:p>
             <w:pPr>
               <w:jc w:val="center"/>
             </w:pPr>
+            <w:proofErr w:type="spellStart"/>
             <w:r>
               <w:rPr>
                 <w:rFonts w:ascii="Times New Roman" w:hAnsi="Times New Roman"/>
                 <w:b/>
                 <w:color w:val="FFFFFF"/>
               </w:rPr>
-              <w:t>Número TC</w:t>
+              <w:t>Número</w:t>
+            </w:r>
+            <w:proofErr w:type="spellEnd"/>
+            <w:r>
+              <w:rPr>
+                <w:rFonts w:ascii="Times New Roman" w:hAnsi="Times New Roman"/>
+                <w:b/>
+                <w:color w:val="FFFFFF"/>
+              </w:rPr>
+              <w:t xml:space="preserve"> TC</w:t>
             </w:r>
           </w:p>
         </w:tc>
         <w:tc>
           <w:tcPr>
-            <w:tcW w:w="2370" w:type="dxa"/>
+            <w:tcW w:w="3238" w:type="dxa"/>
             <w:shd w:val="clear" w:color="auto" w:fill="4472C4"/>
           </w:tcPr>
           <w:p>
             <w:pPr>
               <w:jc w:val="center"/>
             </w:pPr>
+            <w:proofErr w:type="spellStart"/>
             <w:r>
               <w:rPr>
                 <w:rFonts w:ascii="Times New Roman" w:hAnsi="Times New Roman"/>
@@ -707,6 +1017,7 @@
               </w:rPr>
               <w:t>Concepto</w:t>
             </w:r>
+            <w:proofErr w:type="spellEnd"/>
           </w:p>
         </w:tc>
         <w:tc>
@@ -718,13 +1029,23 @@
             <w:pPr>
               <w:jc w:val="center"/>
             </w:pPr>
+            <w:proofErr w:type="spellStart"/>
             <w:r>
               <w:rPr>
                 <w:rFonts w:ascii="Times New Roman" w:hAnsi="Times New Roman"/>
                 <w:b/>
                 <w:color w:val="FFFFFF"/>
               </w:rPr>
-              <w:t>Comprobante de Pago No.</w:t>
+              <w:t>Comprobante</w:t>
+            </w:r>
+            <w:proofErr w:type="spellEnd"/>
+            <w:r>
+              <w:rPr>
+                <w:rFonts w:ascii="Times New Roman" w:hAnsi="Times New Roman"/>
+                <w:b/>
+                <w:color w:val="FFFFFF"/>
+              </w:rPr>
+              <w:t xml:space="preserve"> de Pago No.</w:t>
             </w:r>
           </w:p>
         </w:tc>
@@ -737,14 +1058,34 @@
             <w:pPr>
               <w:jc w:val="center"/>
             </w:pPr>
+            <w:proofErr w:type="spellStart"/>
             <w:r>
               <w:rPr>
                 <w:rFonts w:ascii="Times New Roman" w:hAnsi="Times New Roman"/>
                 <w:b/>
                 <w:color w:val="FFFFFF"/>
               </w:rPr>
-              <w:t>Fecha de Cancelación</w:t>
-            </w:r>
+              <w:t>Fecha</w:t>
+            </w:r>
+            <w:proofErr w:type="spellEnd"/>
+            <w:r>
+              <w:rPr>
+                <w:rFonts w:ascii="Times New Roman" w:hAnsi="Times New Roman"/>
+                <w:b/>
+                <w:color w:val="FFFFFF"/>
+              </w:rPr>
+              <w:t xml:space="preserve"> de </w:t>
+            </w:r>
+            <w:proofErr w:type="spellStart"/>
+            <w:r>
+              <w:rPr>
+                <w:rFonts w:ascii="Times New Roman" w:hAnsi="Times New Roman"/>
+                <w:b/>
+                <w:color w:val="FFFFFF"/>
+              </w:rPr>
+              <w:t>Cancelación</w:t>
+            </w:r>
+            <w:proofErr w:type="spellEnd"/>
           </w:p>
         </w:tc>
         <w:tc>
@@ -762,8 +1103,18 @@
                 <w:b/>
                 <w:color w:val="FFFFFF"/>
               </w:rPr>
-              <w:t>Valor cancelado</w:t>
-            </w:r>
+              <w:t xml:space="preserve">Valor </w:t>
+            </w:r>
+            <w:proofErr w:type="spellStart"/>
+            <w:r>
+              <w:rPr>
+                <w:rFonts w:ascii="Times New Roman" w:hAnsi="Times New Roman"/>
+                <w:b/>
+                <w:color w:val="FFFFFF"/>
+              </w:rPr>
+              <w:t>cancelado</w:t>
+            </w:r>
+            <w:proofErr w:type="spellEnd"/>
           </w:p>
         </w:tc>
       </w:tr>
@@ -773,40 +1124,82 @@
         </w:trPr>
         <w:tc>
           <w:tcPr>
-            <w:tcW w:w="1266" w:type="dxa"/>
+            <w:tcW w:w="988" w:type="dxa"/>
           </w:tcPr>
           <w:p>
             <w:r>
               <w:rPr>
                 <w:rFonts w:ascii="Times New Roman" w:hAnsi="Times New Roman"/>
               </w:rPr>
-              <w:t>{#cancelaciones}{orden}</w:t>
+              <w:t>{#</w:t>
+            </w:r>
+            <w:proofErr w:type="gramStart"/>
+            <w:r>
+              <w:rPr>
+                <w:rFonts w:ascii="Times New Roman" w:hAnsi="Times New Roman"/>
+              </w:rPr>
+              <w:t>cancelaciones}{</w:t>
+            </w:r>
+            <w:proofErr w:type="gramEnd"/>
+            <w:r>
+              <w:rPr>
+                <w:rFonts w:ascii="Times New Roman" w:hAnsi="Times New Roman"/>
+              </w:rPr>
+              <w:t>orden}</w:t>
             </w:r>
           </w:p>
         </w:tc>
         <w:tc>
           <w:tcPr>
-            <w:tcW w:w="1865" w:type="dxa"/>
+            <w:tcW w:w="1275" w:type="dxa"/>
           </w:tcPr>
           <w:p>
             <w:r>
               <w:rPr>
                 <w:rFonts w:ascii="Times New Roman" w:hAnsi="Times New Roman"/>
               </w:rPr>
-              <w:t>{numeroTC}</w:t>
+              <w:t>{</w:t>
+            </w:r>
+            <w:proofErr w:type="spellStart"/>
+            <w:r>
+              <w:rPr>
+                <w:rFonts w:ascii="Times New Roman" w:hAnsi="Times New Roman"/>
+              </w:rPr>
+              <w:t>numeroTC</w:t>
+            </w:r>
+            <w:proofErr w:type="spellEnd"/>
+            <w:r>
+              <w:rPr>
+                <w:rFonts w:ascii="Times New Roman" w:hAnsi="Times New Roman"/>
+              </w:rPr>
+              <w:t>}</w:t>
             </w:r>
           </w:p>
         </w:tc>
         <w:tc>
           <w:tcPr>
-            <w:tcW w:w="2370" w:type="dxa"/>
+            <w:tcW w:w="3238" w:type="dxa"/>
           </w:tcPr>
           <w:p>
             <w:r>
               <w:rPr>
                 <w:rFonts w:ascii="Times New Roman" w:hAnsi="Times New Roman"/>
               </w:rPr>
-              <w:t>{concepto}</w:t>
+              <w:t>{</w:t>
+            </w:r>
+            <w:proofErr w:type="spellStart"/>
+            <w:r>
+              <w:rPr>
+                <w:rFonts w:ascii="Times New Roman" w:hAnsi="Times New Roman"/>
+              </w:rPr>
+              <w:t>concepto</w:t>
+            </w:r>
+            <w:proofErr w:type="spellEnd"/>
+            <w:r>
+              <w:rPr>
+                <w:rFonts w:ascii="Times New Roman" w:hAnsi="Times New Roman"/>
+              </w:rPr>
+              <w:t>}</w:t>
             </w:r>
           </w:p>
         </w:tc>
@@ -819,7 +1212,21 @@
               <w:rPr>
                 <w:rFonts w:ascii="Times New Roman" w:hAnsi="Times New Roman"/>
               </w:rPr>
-              <w:t>{comprobante}</w:t>
+              <w:t>{</w:t>
+            </w:r>
+            <w:proofErr w:type="spellStart"/>
+            <w:r>
+              <w:rPr>
+                <w:rFonts w:ascii="Times New Roman" w:hAnsi="Times New Roman"/>
+              </w:rPr>
+              <w:t>comprobante</w:t>
+            </w:r>
+            <w:proofErr w:type="spellEnd"/>
+            <w:r>
+              <w:rPr>
+                <w:rFonts w:ascii="Times New Roman" w:hAnsi="Times New Roman"/>
+              </w:rPr>
+              <w:t>}</w:t>
             </w:r>
           </w:p>
         </w:tc>
@@ -832,7 +1239,21 @@
               <w:rPr>
                 <w:rFonts w:ascii="Times New Roman" w:hAnsi="Times New Roman"/>
               </w:rPr>
-              <w:t>{fechaCancelacion}</w:t>
+              <w:t>{</w:t>
+            </w:r>
+            <w:proofErr w:type="spellStart"/>
+            <w:r>
+              <w:rPr>
+                <w:rFonts w:ascii="Times New Roman" w:hAnsi="Times New Roman"/>
+              </w:rPr>
+              <w:t>fechaCancelacion</w:t>
+            </w:r>
+            <w:proofErr w:type="spellEnd"/>
+            <w:r>
+              <w:rPr>
+                <w:rFonts w:ascii="Times New Roman" w:hAnsi="Times New Roman"/>
+              </w:rPr>
+              <w:t>}</w:t>
             </w:r>
           </w:p>
         </w:tc>
@@ -845,12 +1266,41 @@
               <w:rPr>
                 <w:rFonts w:ascii="Times New Roman" w:hAnsi="Times New Roman"/>
               </w:rPr>
-              <w:t>{valorCancelado}{/cancelaciones}</w:t>
+              <w:t>{</w:t>
+            </w:r>
+            <w:proofErr w:type="spellStart"/>
+            <w:r>
+              <w:rPr>
+                <w:rFonts w:ascii="Times New Roman" w:hAnsi="Times New Roman"/>
+              </w:rPr>
+              <w:t>valorCancelado</w:t>
+            </w:r>
+            <w:proofErr w:type="spellEnd"/>
+            <w:r>
+              <w:rPr>
+                <w:rFonts w:ascii="Times New Roman" w:hAnsi="Times New Roman"/>
+              </w:rPr>
+              <w:t>}{/</w:t>
+            </w:r>
+            <w:proofErr w:type="spellStart"/>
+            <w:r>
+              <w:rPr>
+                <w:rFonts w:ascii="Times New Roman" w:hAnsi="Times New Roman"/>
+              </w:rPr>
+              <w:t>cancelaciones</w:t>
+            </w:r>
+            <w:proofErr w:type="spellEnd"/>
+            <w:r>
+              <w:rPr>
+                <w:rFonts w:ascii="Times New Roman" w:hAnsi="Times New Roman"/>
+              </w:rPr>
+              <w:t>}</w:t>
             </w:r>
           </w:p>
         </w:tc>
       </w:tr>
     </w:tbl>
+    <w:bookmarkEnd w:id="2"/>
     <w:p>
       <w:pPr>
         <w:pStyle w:val="Sinespaciado"/>
@@ -948,6 +1398,7 @@
         </w:rPr>
         <w:t xml:space="preserve"> </w:t>
       </w:r>
+      <w:proofErr w:type="spellStart"/>
       <w:r>
         <w:rPr>
           <w:rFonts w:ascii="Times New Roman" w:hAnsi="Times New Roman"/>
@@ -960,7 +1411,15 @@
           <w:rFonts w:ascii="Times New Roman" w:hAnsi="Times New Roman"/>
           <w:color w:val="0070C0"/>
         </w:rPr>
-        <w:t xml:space="preserve">ecretari{genero} </w:t>
+        <w:t>ecretari</w:t>
+      </w:r>
+      <w:proofErr w:type="spellEnd"/>
+      <w:r>
+        <w:rPr>
+          <w:rFonts w:ascii="Times New Roman" w:hAnsi="Times New Roman"/>
+          <w:color w:val="0070C0"/>
+        </w:rPr>
+        <w:t xml:space="preserve">{genero} </w:t>
       </w:r>
       <w:r>
         <w:rPr>
@@ -980,8 +1439,16 @@
         <w:rPr>
           <w:rFonts w:ascii="Times New Roman" w:hAnsi="Times New Roman"/>
         </w:rPr>
-        <w:t xml:space="preserve"> extern</w:t>
-      </w:r>
+        <w:t xml:space="preserve"> </w:t>
+      </w:r>
+      <w:proofErr w:type="spellStart"/>
+      <w:r>
+        <w:rPr>
+          <w:rFonts w:ascii="Times New Roman" w:hAnsi="Times New Roman"/>
+        </w:rPr>
+        <w:t>extern</w:t>
+      </w:r>
+      <w:proofErr w:type="spellEnd"/>
       <w:r>
         <w:rPr>
           <w:rFonts w:ascii="Times New Roman" w:hAnsi="Times New Roman"/>
@@ -1030,15 +1497,38 @@
         <w:rPr>
           <w:rFonts w:ascii="Times New Roman" w:hAnsi="Times New Roman"/>
         </w:rPr>
-        <w:t xml:space="preserve">el archivo del procedimiento coactivo. - Actúe como Secretari{genero} Abogad{genero} </w:t>
-      </w:r>
-      <w:r>
-        <w:rPr>
-          <w:rFonts w:ascii="Times New Roman" w:hAnsi="Times New Roman"/>
-          <w:color w:val="0070C0"/>
-        </w:rPr>
-        <w:t>{pronombre} {</w:t>
-      </w:r>
+        <w:t xml:space="preserve">el archivo del procedimiento coactivo. - Actúe como </w:t>
+      </w:r>
+      <w:proofErr w:type="spellStart"/>
+      <w:r>
+        <w:rPr>
+          <w:rFonts w:ascii="Times New Roman" w:hAnsi="Times New Roman"/>
+        </w:rPr>
+        <w:t>Secretari</w:t>
+      </w:r>
+      <w:proofErr w:type="spellEnd"/>
+      <w:r>
+        <w:rPr>
+          <w:rFonts w:ascii="Times New Roman" w:hAnsi="Times New Roman"/>
+        </w:rPr>
+        <w:t xml:space="preserve">{genero} Abogad{genero} </w:t>
+      </w:r>
+      <w:r>
+        <w:rPr>
+          <w:rFonts w:ascii="Times New Roman" w:hAnsi="Times New Roman"/>
+          <w:color w:val="0070C0"/>
+        </w:rPr>
+        <w:t xml:space="preserve">{pronombre} </w:t>
+      </w:r>
+      <w:r>
+        <w:rPr>
+          <w:rFonts w:ascii="Times New Roman" w:hAnsi="Times New Roman"/>
+          <w:color w:val="0070C0"/>
+        </w:rPr>
+        <w:lastRenderedPageBreak/>
+        <w:t>{</w:t>
+      </w:r>
+      <w:proofErr w:type="spellStart"/>
       <w:r>
         <w:rPr>
           <w:rFonts w:ascii="Times New Roman" w:hAnsi="Times New Roman"/>
@@ -1046,6 +1536,7 @@
         </w:rPr>
         <w:t>abogadoNombreMinusculas</w:t>
       </w:r>
+      <w:proofErr w:type="spellEnd"/>
       <w:r>
         <w:rPr>
           <w:rFonts w:ascii="Times New Roman" w:hAnsi="Times New Roman"/>
@@ -1057,26 +1548,41 @@
         <w:rPr>
           <w:rFonts w:ascii="Times New Roman" w:hAnsi="Times New Roman"/>
         </w:rPr>
-        <w:t xml:space="preserve">, quien hallándose presente acepta el cargo y jura desempeñarlo fiel y legalmente, </w:t>
-      </w:r>
-      <w:r>
-        <w:rPr>
-          <w:rFonts w:ascii="Times New Roman" w:hAnsi="Times New Roman"/>
-        </w:rPr>
-        <w:lastRenderedPageBreak/>
-        <w:t xml:space="preserve">firmando para constancia con </w:t>
-      </w:r>
-      <w:r>
-        <w:rPr>
-          <w:rFonts w:ascii="Times New Roman" w:hAnsi="Times New Roman"/>
-        </w:rPr>
-        <w:t xml:space="preserve">la </w:t>
-      </w:r>
-      <w:r>
-        <w:rPr>
-          <w:rFonts w:ascii="Times New Roman" w:hAnsi="Times New Roman"/>
-        </w:rPr>
-        <w:t>Directora Provincial de Pichincha Encargad</w:t>
+        <w:t xml:space="preserve">, quien hallándose presente acepta el cargo y jura desempeñarlo fiel y legalmente, firmando para constancia </w:t>
+      </w:r>
+      <w:bookmarkStart w:id="3" w:name="_Hlk218588259"/>
+      <w:bookmarkStart w:id="4" w:name="_Hlk218587892"/>
+      <w:r>
+        <w:rPr>
+          <w:rFonts w:ascii="Times New Roman" w:hAnsi="Times New Roman"/>
+        </w:rPr>
+        <w:t>con</w:t>
+      </w:r>
+      <w:r>
+        <w:rPr>
+          <w:rFonts w:ascii="Times New Roman" w:hAnsi="Times New Roman"/>
+        </w:rPr>
+        <w:t xml:space="preserve"> el</w:t>
+      </w:r>
+      <w:r>
+        <w:rPr>
+          <w:rFonts w:ascii="Times New Roman" w:hAnsi="Times New Roman"/>
+        </w:rPr>
+        <w:t xml:space="preserve"> </w:t>
+      </w:r>
+      <w:proofErr w:type="gramStart"/>
+      <w:r>
+        <w:rPr>
+          <w:rFonts w:ascii="Times New Roman" w:hAnsi="Times New Roman"/>
+        </w:rPr>
+        <w:t>Director Provincial</w:t>
+      </w:r>
+      <w:proofErr w:type="gramEnd"/>
+      <w:r>
+        <w:rPr>
+          <w:rFonts w:ascii="Times New Roman" w:hAnsi="Times New Roman"/>
+        </w:rPr>
+        <w:t xml:space="preserve"> de Pichincha Encargad</w:t>
       </w:r>
       <w:r>
         <w:rPr>
@@ -1095,8 +1601,17 @@
           <w:rFonts w:ascii="Times New Roman" w:hAnsi="Times New Roman"/>
           <w:b/>
         </w:rPr>
-        <w:t>CÚMPLASE y NOTIFÍQUESE.</w:t>
-      </w:r>
+        <w:t>CÚMPLASE y NOTIFÍQUESE</w:t>
+      </w:r>
+      <w:bookmarkEnd w:id="3"/>
+      <w:r>
+        <w:rPr>
+          <w:rFonts w:ascii="Times New Roman" w:hAnsi="Times New Roman"/>
+          <w:b/>
+        </w:rPr>
+        <w:t>.</w:t>
+      </w:r>
+      <w:bookmarkEnd w:id="4"/>
     </w:p>
     <w:p>
       <w:pPr>
@@ -1140,18 +1655,42 @@
           <w:bCs/>
         </w:rPr>
       </w:pPr>
-      <w:r>
-        <w:rPr>
-          <w:rFonts w:ascii="Times New Roman" w:hAnsi="Times New Roman"/>
-        </w:rPr>
-        <w:t>Ing. Benitez Estrella Christian Sebastian</w:t>
-      </w:r>
+      <w:bookmarkStart w:id="5" w:name="_Hlk218587917"/>
+      <w:bookmarkStart w:id="6" w:name="_Hlk218588272"/>
+      <w:bookmarkStart w:id="7" w:name="_Hlk218589207"/>
+      <w:r>
+        <w:rPr>
+          <w:rFonts w:ascii="Times New Roman" w:hAnsi="Times New Roman"/>
+        </w:rPr>
+        <w:t xml:space="preserve">Ing. </w:t>
+      </w:r>
+      <w:r>
+        <w:rPr>
+          <w:rFonts w:ascii="Times New Roman" w:hAnsi="Times New Roman"/>
+        </w:rPr>
+        <w:t>Benítez</w:t>
+      </w:r>
+      <w:r>
+        <w:rPr>
+          <w:rFonts w:ascii="Times New Roman" w:hAnsi="Times New Roman"/>
+        </w:rPr>
+        <w:t xml:space="preserve"> Estrella Christian </w:t>
+      </w:r>
+      <w:bookmarkEnd w:id="5"/>
+      <w:r>
+        <w:rPr>
+          <w:rFonts w:ascii="Times New Roman" w:hAnsi="Times New Roman"/>
+        </w:rPr>
+        <w:t>Sebastián</w:t>
+      </w:r>
+      <w:bookmarkEnd w:id="6"/>
       <w:r>
         <w:rPr>
           <w:rFonts w:ascii="Times New Roman" w:hAnsi="Times New Roman" w:cs="Times New Roman"/>
         </w:rPr>
         <w:t>.</w:t>
       </w:r>
+      <w:bookmarkEnd w:id="7"/>
       <w:r>
         <w:rPr>
           <w:rFonts w:ascii="Times New Roman" w:hAnsi="Times New Roman" w:cs="Times New Roman"/>
@@ -1177,6 +1716,7 @@
         </w:rPr>
         <w:t>{</w:t>
       </w:r>
+      <w:proofErr w:type="spellStart"/>
       <w:r>
         <w:rPr>
           <w:rFonts w:ascii="Times New Roman" w:hAnsi="Times New Roman"/>
@@ -1184,6 +1724,7 @@
         </w:rPr>
         <w:t>abogadoNombreMinusculas</w:t>
       </w:r>
+      <w:proofErr w:type="spellEnd"/>
       <w:r>
         <w:rPr>
           <w:rFonts w:ascii="Times New Roman" w:hAnsi="Times New Roman"/>
@@ -1251,7 +1792,27 @@
           <w:bCs/>
           <w:color w:val="0070C0"/>
         </w:rPr>
-        <w:t>{fechaProvidencia}</w:t>
+        <w:t>{</w:t>
+      </w:r>
+      <w:proofErr w:type="spellStart"/>
+      <w:r>
+        <w:rPr>
+          <w:rFonts w:ascii="Times New Roman" w:hAnsi="Times New Roman"/>
+          <w:b/>
+          <w:bCs/>
+          <w:color w:val="0070C0"/>
+        </w:rPr>
+        <w:t>fechaProvidencia</w:t>
+      </w:r>
+      <w:proofErr w:type="spellEnd"/>
+      <w:r>
+        <w:rPr>
+          <w:rFonts w:ascii="Times New Roman" w:hAnsi="Times New Roman"/>
+          <w:b/>
+          <w:bCs/>
+          <w:color w:val="0070C0"/>
+        </w:rPr>
+        <w:t>}</w:t>
       </w:r>
       <w:r>
         <w:rPr>
@@ -1315,6 +1876,7 @@
         </w:rPr>
         <w:t>{</w:t>
       </w:r>
+      <w:proofErr w:type="spellStart"/>
       <w:r>
         <w:rPr>
           <w:rFonts w:ascii="Times New Roman" w:hAnsi="Times New Roman"/>
@@ -1322,6 +1884,7 @@
         </w:rPr>
         <w:t>abogadoNombreMinusculas</w:t>
       </w:r>
+      <w:proofErr w:type="spellEnd"/>
       <w:r>
         <w:rPr>
           <w:rFonts w:ascii="Times New Roman" w:hAnsi="Times New Roman"/>

</xml_diff>